<commit_message>
feat: versión final del taller - informe, capturas, makefile y readme
- Informe actualizado con nombres de integrantes y rutas corregidas
- Capturas de pantalla del código funcionando (6 imágenes)
- Makefile para compilación automatizada
- README.md con instrucciones y estructura del proyecto
- Documentación detallada en doc/shell_documentacion.md
</commit_message>
<xml_diff>
--- a/Informe_Taller1_SistemasOperativos.docx
+++ b/Informe_Taller1_SistemasOperativos.docx
@@ -185,13 +185,10 @@
       </w:pPr>
       <w:r>
         <w:rPr>
-          <w:rFonts w:ascii="Times New Roman" w:cs="Times New Roman" w:eastAsia="Times New Roman" w:hAnsi="Times New Roman"/>
-          <w:i/>
-          <w:iCs/>
-          <w:sz w:val="24"/>
-          <w:szCs w:val="24"/>
-        </w:rPr>
-        <w:t xml:space="preserve">[Nombre de los integrantes del grupo]</w:t>
+          <w:rFonts w:ascii="Calibri" w:hAnsi="Calibri"/>
+          <w:sz w:val="24"/>
+        </w:rPr>
+        <w:t>Javier Morales, Ignacio Barra, Carlos Bastidas, Matias Salazar</w:t>
       </w:r>
     </w:p>
     <w:p>
@@ -380,7 +377,7 @@
           <w:sz w:val="24"/>
           <w:szCs w:val="24"/>
         </w:rPr>
-        <w:t xml:space="preserve">En el contexto del Taller 1 de la asignatura Sistemas Operativos (Primer Semestre 2026), se solicitó diseñar e implementar una shell básica en lenguaje C, identificando las llamadas a sistema necesarias para cada funcionalidad. Este informe documenta las decisiones de diseño, las llamadas a sistema empleadas, el código desarrollado, y las evidencias de ejecución que demuestran el correcto funcionamiento del programa.</w:t>
+        <w:t>En el contexto del Taller 1 de la asignatura Sistemas Operativos (Primer Semestre 2026), se solicitó diseñar e implementar una shell básica en lenguaje C, identificando las llamadas a sistema necesarias para cada funcionalidad. Este informe documenta las decisiones de diseño, las llamadas a sistema empleadas, el código desarrollado, y las evidencias de ejecución que demuestran el correcto funcionamiento del programa.</w:t>
       </w:r>
     </w:p>
     <w:p>
@@ -2565,7 +2562,7 @@
           <w:sz w:val="24"/>
           <w:szCs w:val="24"/>
         </w:rPr>
-        <w:t xml:space="preserve">Evidencias de Ejecución</w:t>
+        <w:t>Evidencias de Ejecución</w:t>
       </w:r>
     </w:p>
     <w:p>
@@ -2787,7 +2784,7 @@
           <w:sz w:val="24"/>
           <w:szCs w:val="24"/>
         </w:rPr>
-        <w:t xml:space="preserve">Nota: Las capturas de pantalla correspondientes a cada prueba se encuentran disponibles en el repositorio del proyecto, en la carpeta /evidencias/.</w:t>
+        <w:t>Nota: Las capturas de pantalla correspondientes a cada prueba se encuentran disponibles en el repositorio del proyecto, en la carpeta /screenshots/.</w:t>
       </w:r>
     </w:p>
     <w:p>

</xml_diff>